<commit_message>
Update: Warna minimal IPA - maksimal 3 warna per slide, kategori berbeda
</commit_message>
<xml_diff>
--- a/out/Prompt-Video-IPA.docx
+++ b/out/Prompt-Video-IPA.docx
@@ -324,6 +324,14 @@
     </w:p>
     <w:p>
       <w:pPr>
+        <w:pStyle w:val="ListBullet"/>
+      </w:pPr>
+      <w:r>
+        <w:t>1.3 Formula Prompt Sains</w:t>
+      </w:r>
+    </w:p>
+    <w:p>
+      <w:pPr>
         <w:pStyle w:val="Heading1"/>
       </w:pPr>
       <w:r>
@@ -359,7 +367,23 @@
         <w:pStyle w:val="Heading1"/>
       </w:pPr>
       <w:r>
-        <w:t>1.3 Tips Memaksimalkan Prompt</w:t>
+        <w:t>1.3 Formula Prompt Efektif</w:t>
+      </w:r>
+    </w:p>
+    <w:p>
+      <w:pPr>
+        <w:spacing w:line="360" w:lineRule="auto"/>
+      </w:pPr>
+      <w:r>
+        <w:t>Gunakan formula ini untuk membuat prompt yang konsisten:</w:t>
+      </w:r>
+    </w:p>
+    <w:p>
+      <w:pPr>
+        <w:spacing w:line="360" w:lineRule="auto"/>
+      </w:pPr>
+      <w:r>
+        <w:t>Contoh penerapan:</w:t>
       </w:r>
     </w:p>
     <w:p>
@@ -367,6 +391,70 @@
         <w:pStyle w:val="ListBullet"/>
       </w:pPr>
       <w:r>
+        <w:t>Subjek: "Molekul air"</w:t>
+      </w:r>
+    </w:p>
+    <w:p>
+      <w:pPr>
+        <w:pStyle w:val="ListBullet"/>
+      </w:pPr>
+      <w:r>
+        <w:t>Aksi: "berinteraksi membentuk ikatan hidrogen"</w:t>
+      </w:r>
+    </w:p>
+    <w:p>
+      <w:pPr>
+        <w:pStyle w:val="ListBullet"/>
+      </w:pPr>
+      <w:r>
+        <w:t>Detail: "setiap ikatan digarisbawahi dengan warna berbeda"</w:t>
+      </w:r>
+    </w:p>
+    <w:p>
+      <w:pPr>
+        <w:pStyle w:val="ListBullet"/>
+      </w:pPr>
+      <w:r>
+        <w:t>Lingkungan: "latar hitam dengan grid koordinat halus"</w:t>
+      </w:r>
+    </w:p>
+    <w:p>
+      <w:pPr>
+        <w:pStyle w:val="ListBullet"/>
+      </w:pPr>
+      <w:r>
+        <w:t>Gaya: "3D scientific visualization, soft studio lighting"</w:t>
+      </w:r>
+    </w:p>
+    <w:p>
+      <w:pPr>
+        <w:pStyle w:val="ListBullet"/>
+      </w:pPr>
+      <w:r>
+        <w:t>Parameter: "16:9, slow rotation, high detail"</w:t>
+      </w:r>
+    </w:p>
+    <w:p>
+      <w:pPr>
+        <w:spacing w:line="360" w:lineRule="auto"/>
+      </w:pPr>
+      <w:r>
+        <w:t>Hasil final: "Molekul air H2O berinteraksi membentuk ikatan hidrogen dengan pasangan molekul lain, setiap ikatan digarisbawahi dengan warna biru neon, latar hitam dengan grid koordinat halus, gaya 3D scientific visualization dengan soft studio lighting, rasio 16:9, rotasi lambat, detail tinggi."</w:t>
+      </w:r>
+    </w:p>
+    <w:p>
+      <w:pPr>
+        <w:pStyle w:val="Heading1"/>
+      </w:pPr>
+      <w:r>
+        <w:t>1.4 Tips Memaksimalkan Prompt</w:t>
+      </w:r>
+    </w:p>
+    <w:p>
+      <w:pPr>
+        <w:pStyle w:val="ListBullet"/>
+      </w:pPr>
+      <w:r>
         <w:t>Spesifik tapi tidak berlebihan — 2-4 klausa sudah cukup</w:t>
       </w:r>
     </w:p>
@@ -404,6 +492,54 @@
     </w:p>
     <w:p>
       <w:pPr>
+        <w:pStyle w:val="ListBullet"/>
+      </w:pPr>
+      <w:r>
+        <w:t>Jelaskan gerakan kamera — "zoom in", "pan", "rotate", "static"</w:t>
+      </w:r>
+    </w:p>
+    <w:p>
+      <w:pPr>
+        <w:pStyle w:val="ListBullet"/>
+      </w:pPr>
+      <w:r>
+        <w:t>Close-up: Fokus pada detail kecil (sel, molekul)</w:t>
+      </w:r>
+    </w:p>
+    <w:p>
+      <w:pPr>
+        <w:pStyle w:val="ListBullet"/>
+      </w:pPr>
+      <w:r>
+        <w:t>Medium shot: Menunjukkan interaksi antar objek</w:t>
+      </w:r>
+    </w:p>
+    <w:p>
+      <w:pPr>
+        <w:pStyle w:val="ListBullet"/>
+      </w:pPr>
+      <w:r>
+        <w:t>Wide shot: Konteks lengkap (sistem, ekosistem)</w:t>
+      </w:r>
+    </w:p>
+    <w:p>
+      <w:pPr>
+        <w:pStyle w:val="ListBullet"/>
+      </w:pPr>
+      <w:r>
+        <w:t>Bird's eye: Pandangan dari atas (baik untuk peta, diagram)</w:t>
+      </w:r>
+    </w:p>
+    <w:p>
+      <w:pPr>
+        <w:pStyle w:val="ListBullet"/>
+      </w:pPr>
+      <w:r>
+        <w:t>Eye-level: Sama seperti mata pengamat (realistis)</w:t>
+      </w:r>
+    </w:p>
+    <w:p>
+      <w:pPr>
         <w:spacing w:line="360" w:lineRule="auto"/>
       </w:pPr>
       <w:r>
@@ -415,7 +551,7 @@
         <w:pStyle w:val="Heading1"/>
       </w:pPr>
       <w:r>
-        <w:t>1.4 Parameter Teknis yang Umum</w:t>
+        <w:t>1.5 Parameter Teknis yang Umum</w:t>
       </w:r>
     </w:p>
     <w:p>
@@ -495,7 +631,7 @@
         <w:pStyle w:val="ListBullet"/>
       </w:pPr>
       <w:r>
-        <w:t>2.5 Energi Kinetik dan Potensial</w:t>
+        <w:t>2.5 Hukum Kepler (Gerak Planet)</w:t>
       </w:r>
     </w:p>
     <w:p>
@@ -503,7 +639,7 @@
         <w:pStyle w:val="ListBullet"/>
       </w:pPr>
       <w:r>
-        <w:t>2.6 Hukum Kekekalan Energi</w:t>
+        <w:t>2.6 Energi Kinetik dan Potensial</w:t>
       </w:r>
     </w:p>
     <w:p>
@@ -511,7 +647,7 @@
         <w:pStyle w:val="ListBullet"/>
       </w:pPr>
       <w:r>
-        <w:t>2.7 Energi Panas dan Pemuaian</w:t>
+        <w:t>2.7 Hukum Kekekalan Energi Mekanik</w:t>
       </w:r>
     </w:p>
     <w:p>
@@ -519,7 +655,7 @@
         <w:pStyle w:val="ListBullet"/>
       </w:pPr>
       <w:r>
-        <w:t>2.8 Gelombang longitudinal (Bunyi)</w:t>
+        <w:t>2.8 Usaha dan Energi</w:t>
       </w:r>
     </w:p>
     <w:p>
@@ -527,7 +663,7 @@
         <w:pStyle w:val="ListBullet"/>
       </w:pPr>
       <w:r>
-        <w:t>2.9 Gelombang transversal</w:t>
+        <w:t>2.9 Energi Panas dan Pemuaian</w:t>
       </w:r>
     </w:p>
     <w:p>
@@ -535,7 +671,7 @@
         <w:pStyle w:val="ListBullet"/>
       </w:pPr>
       <w:r>
-        <w:t>2.10 Interferensi Gelombang</w:t>
+        <w:t>2.10 Perubahan Energi (Hukum Termodinamika)</w:t>
       </w:r>
     </w:p>
     <w:p>
@@ -543,7 +679,7 @@
         <w:pStyle w:val="ListBullet"/>
       </w:pPr>
       <w:r>
-        <w:t>2.11 Pemantulan Cahaya</w:t>
+        <w:t>2.11 Gelombang longitudinal (Bunyi)</w:t>
       </w:r>
     </w:p>
     <w:p>
@@ -551,7 +687,7 @@
         <w:pStyle w:val="ListBullet"/>
       </w:pPr>
       <w:r>
-        <w:t>2.12 Pembiasan Cahaya</w:t>
+        <w:t>2.12 Gelombang transversal</w:t>
       </w:r>
     </w:p>
     <w:p>
@@ -591,7 +727,7 @@
         <w:spacing w:line="360" w:lineRule="auto"/>
       </w:pPr>
       <w:r>
-        <w:t>Prompt fisika berfokus pada visualisasi hukum dan prinsip — gunakan kata kunci seperti "hukum", "demonstrasi", "grafik", "diagram" untuk hasil yang edukatif.</w:t>
+        <w:t>Prompt fisika berfokus pada visualisasi hukum dan prinsip — gunakan kata kunci seperti "hukum", "demonstrasi", "grafik", "diagram", "panah vektor", "real-time calculation" untuk hasil yang edukatif dan informatif.</w:t>
       </w:r>
     </w:p>
     <w:p>
@@ -631,7 +767,7 @@
         <w:pStyle w:val="ListBullet"/>
       </w:pPr>
       <w:r>
-        <w:t>3.1 Reaksi Pembakaran</w:t>
+        <w:t>3.1 Reaksi Pembakaran Natrium</w:t>
       </w:r>
     </w:p>
     <w:p>
@@ -639,7 +775,7 @@
         <w:pStyle w:val="ListBullet"/>
       </w:pPr>
       <w:r>
-        <w:t>3.2 Reaksi Asam-Basa</w:t>
+        <w:t>3.2 Reaksi Asam-Basa (Netralisasi)</w:t>
       </w:r>
     </w:p>
     <w:p>
@@ -655,7 +791,7 @@
         <w:pStyle w:val="ListBullet"/>
       </w:pPr>
       <w:r>
-        <w:t>3.4 Reaksi Redoks</w:t>
+        <w:t>3.4 Reaksi Redoks (Zn dan CuSO4)</w:t>
       </w:r>
     </w:p>
     <w:p>
@@ -663,7 +799,7 @@
         <w:pStyle w:val="ListBullet"/>
       </w:pPr>
       <w:r>
-        <w:t>3.5 Model Atom Bohr</w:t>
+        <w:t>3.5 Laju Reaksi (Faktor-faktor)</w:t>
       </w:r>
     </w:p>
     <w:p>
@@ -671,7 +807,7 @@
         <w:pStyle w:val="ListBullet"/>
       </w:pPr>
       <w:r>
-        <w:t>3.6 Ikatan Ion</w:t>
+        <w:t>3.6 Model Atom Bohr</w:t>
       </w:r>
     </w:p>
     <w:p>
@@ -679,7 +815,7 @@
         <w:pStyle w:val="ListBullet"/>
       </w:pPr>
       <w:r>
-        <w:t>3.7 Ikatan Kovalen</w:t>
+        <w:t>3.7 Ikatan Ion (NaCl)</w:t>
       </w:r>
     </w:p>
     <w:p>
@@ -687,7 +823,7 @@
         <w:pStyle w:val="ListBullet"/>
       </w:pPr>
       <w:r>
-        <w:t>3.8 Proses Pelarutan</w:t>
+        <w:t>3.8 Ikatan Kovalen (H2)</w:t>
       </w:r>
     </w:p>
     <w:p>
@@ -695,7 +831,7 @@
         <w:pStyle w:val="ListBullet"/>
       </w:pPr>
       <w:r>
-        <w:t>3.9 Elektrolit vs Non-elektrolit</w:t>
+        <w:t>3.9 Ikatan Logam</w:t>
       </w:r>
     </w:p>
     <w:p>
@@ -703,7 +839,7 @@
         <w:pStyle w:val="ListBullet"/>
       </w:pPr>
       <w:r>
-        <w:t>3.10 Kelarutan dan Suhu</w:t>
+        <w:t>3.10 Ikatan Hidrogen (Air)</w:t>
       </w:r>
     </w:p>
     <w:p>
@@ -711,7 +847,7 @@
         <w:pStyle w:val="ListBullet"/>
       </w:pPr>
       <w:r>
-        <w:t>3.11 Struktur Metana (CH4)</w:t>
+        <w:t>3.11 Proses Pelarutan Gula</w:t>
       </w:r>
     </w:p>
     <w:p>
@@ -719,7 +855,7 @@
         <w:pStyle w:val="ListBullet"/>
       </w:pPr>
       <w:r>
-        <w:t>3.12 Isomeri</w:t>
+        <w:t>3.12 Elektrolit vs Non-elektrolit</w:t>
       </w:r>
     </w:p>
     <w:p>
@@ -759,7 +895,7 @@
         <w:spacing w:line="360" w:lineRule="auto"/>
       </w:pPr>
       <w:r>
-        <w:t>Prompt kimia efektif ketika menampilkan perubahan tingkat makro (warna, endapan) bersamaan dengan penjelasan tingkat mikro (molekul, ion).</w:t>
+        <w:t>Prompt kimia efektif ketika menampilkan perubahan tingkat makro (warna, endapan, gelembung) bersamaan dengan penjelasan tingkat mikro (molekul, ion, elektron). Gunakan transisi visual dari makro ke mikro untuk pemahaman konseptual.</w:t>
       </w:r>
     </w:p>
     <w:p>
@@ -799,7 +935,7 @@
         <w:pStyle w:val="ListBullet"/>
       </w:pPr>
       <w:r>
-        <w:t>4.1 Struktur Sel Hewan</w:t>
+        <w:t>4.1 Struktur Sel Hewan (Animasi Detail)</w:t>
       </w:r>
     </w:p>
     <w:p>
@@ -807,7 +943,7 @@
         <w:pStyle w:val="ListBullet"/>
       </w:pPr>
       <w:r>
-        <w:t>4.2 Fotosintesis</w:t>
+        <w:t>4.2 Fotosintesis (Tahap Cahaya dan Gelap)</w:t>
       </w:r>
     </w:p>
     <w:p>
@@ -815,7 +951,7 @@
         <w:pStyle w:val="ListBullet"/>
       </w:pPr>
       <w:r>
-        <w:t>4.3 Respirasi Seluler</w:t>
+        <w:t>4.3 Respirasi Seluler (Glikolisis sampai Siklus Krebs)</w:t>
       </w:r>
     </w:p>
     <w:p>
@@ -823,7 +959,7 @@
         <w:pStyle w:val="ListBullet"/>
       </w:pPr>
       <w:r>
-        <w:t>4.4 Mitosis</w:t>
+        <w:t>4.4 Mitosis (4 Fase Utama)</w:t>
       </w:r>
     </w:p>
     <w:p>
@@ -831,7 +967,7 @@
         <w:pStyle w:val="ListBullet"/>
       </w:pPr>
       <w:r>
-        <w:t>4.5 Sistem Peredaran Darah</w:t>
+        <w:t>4.5 Meiosis (Pembentukan Gamet)</w:t>
       </w:r>
     </w:p>
     <w:p>
@@ -839,7 +975,7 @@
         <w:pStyle w:val="ListBullet"/>
       </w:pPr>
       <w:r>
-        <w:t>4.6 Sistem Pencernaan</w:t>
+        <w:t>4.6 Sistem Peredaran Darah (Sirkulasi Ganda)</w:t>
       </w:r>
     </w:p>
     <w:p>
@@ -847,7 +983,7 @@
         <w:pStyle w:val="ListBullet"/>
       </w:pPr>
       <w:r>
-        <w:t>4.7 Sistem Saraf</w:t>
+        <w:t>4.7 Sistem Pencernaan (Perjalanan Makanan)</w:t>
       </w:r>
     </w:p>
     <w:p>
@@ -855,7 +991,7 @@
         <w:pStyle w:val="ListBullet"/>
       </w:pPr>
       <w:r>
-        <w:t>4.8 Rantai Makanan</w:t>
+        <w:t>4.8 Sistem Saraf (Impuls Saraf)</w:t>
       </w:r>
     </w:p>
     <w:p>
@@ -863,7 +999,7 @@
         <w:pStyle w:val="ListBullet"/>
       </w:pPr>
       <w:r>
-        <w:t>4.9 Siklus Karbon</w:t>
+        <w:t>4.9 Sistem Imun (Respons Imun)</w:t>
       </w:r>
     </w:p>
     <w:p>
@@ -871,7 +1007,7 @@
         <w:pStyle w:val="ListBullet"/>
       </w:pPr>
       <w:r>
-        <w:t>4.10 Daur Air</w:t>
+        <w:t>4.10 Sistem Endokrin (Hormon)</w:t>
       </w:r>
     </w:p>
     <w:p>
@@ -879,7 +1015,7 @@
         <w:pStyle w:val="ListBullet"/>
       </w:pPr>
       <w:r>
-        <w:t>4.11 Seleksi Alam</w:t>
+        <w:t>4.11 Rantai Makanan (Aliran Energi)</w:t>
       </w:r>
     </w:p>
     <w:p>
@@ -887,7 +1023,7 @@
         <w:pStyle w:val="ListBullet"/>
       </w:pPr>
       <w:r>
-        <w:t>4.12 Adaptasi</w:t>
+        <w:t>4.12 Siklus Karbon</w:t>
       </w:r>
     </w:p>
     <w:p>
@@ -927,7 +1063,7 @@
         <w:spacing w:line="360" w:lineRule="auto"/>
       </w:pPr>
       <w:r>
-        <w:t>Prompt biologi paling efektif ketika menampilkan proses dinamis (pertumbuhan, pergerakan, perubahan) bersama dengan label struktural.</w:t>
+        <w:t>Prompt biologi paling efektif ketika menampilkan proses dinamis (pertumbuhan, pergerakan, perubahan) bersama dengan label struktural dan animasi timing yang tepat. Tampilkan juga level organisasi (molekul → sel → organ → sistem).</w:t>
       </w:r>
     </w:p>
     <w:p>
@@ -967,7 +1103,7 @@
         <w:pStyle w:val="ListBullet"/>
       </w:pPr>
       <w:r>
-        <w:t>5.1 Sistem Tata Surya</w:t>
+        <w:t>5.1 Sistem Tata Surya (Skala dan Orbit)</w:t>
       </w:r>
     </w:p>
     <w:p>
@@ -975,7 +1111,7 @@
         <w:pStyle w:val="ListBullet"/>
       </w:pPr>
       <w:r>
-        <w:t>5.2 Fase Bulan</w:t>
+        <w:t>5.2 Fase Bulan (Evolusi Mengelilingi Bumi)</w:t>
       </w:r>
     </w:p>
     <w:p>
@@ -983,7 +1119,7 @@
         <w:pStyle w:val="ListBullet"/>
       </w:pPr>
       <w:r>
-        <w:t>5.3 Gerhana Bulan</w:t>
+        <w:t>5.3 Gerhana Bulan (Luna Eclipse)</w:t>
       </w:r>
     </w:p>
     <w:p>
@@ -991,7 +1127,7 @@
         <w:pStyle w:val="ListBullet"/>
       </w:pPr>
       <w:r>
-        <w:t>5.4 Lempeng Tektonik</w:t>
+        <w:t>5.4 Gerhana Matahari (Solar Eclipse)</w:t>
       </w:r>
     </w:p>
     <w:p>
@@ -999,7 +1135,7 @@
         <w:pStyle w:val="ListBullet"/>
       </w:pPr>
       <w:r>
-        <w:t>5.5 Siklus Batuan</w:t>
+        <w:t>5.5 Rotasi dan Revolusi Bumi</w:t>
       </w:r>
     </w:p>
     <w:p>
@@ -1007,7 +1143,7 @@
         <w:pStyle w:val="ListBullet"/>
       </w:pPr>
       <w:r>
-        <w:t>5.6 Struktur Interior Bumi</w:t>
+        <w:t>5.6 Lempeng Tektonik (Pergerakan)</w:t>
       </w:r>
     </w:p>
     <w:p>
@@ -1015,7 +1151,7 @@
         <w:pStyle w:val="ListBullet"/>
       </w:pPr>
       <w:r>
-        <w:t>5.7 Siklus Air (Hidrologi)</w:t>
+        <w:t>5.7 Siklus Batuan (Rock Cycle)</w:t>
       </w:r>
     </w:p>
     <w:p>
@@ -1023,7 +1159,7 @@
         <w:pStyle w:val="ListBullet"/>
       </w:pPr>
       <w:r>
-        <w:t>5.8 Pola Cuaca</w:t>
+        <w:t>5.8 Struktur Interior Bumi</w:t>
       </w:r>
     </w:p>
     <w:p>
@@ -1031,7 +1167,7 @@
         <w:pStyle w:val="ListBullet"/>
       </w:pPr>
       <w:r>
-        <w:t>5.9 Efek Rumah Kaca</w:t>
+        <w:t>5.9 Gunung Berapi (Eruption Types)</w:t>
       </w:r>
     </w:p>
     <w:p>
@@ -1039,7 +1175,7 @@
         <w:pStyle w:val="ListBullet"/>
       </w:pPr>
       <w:r>
-        <w:t>5.10 Deforestasi</w:t>
+        <w:t>5.10 Gempa Bumi (Seismology)</w:t>
       </w:r>
     </w:p>
     <w:p>
@@ -1047,7 +1183,15 @@
         <w:pStyle w:val="ListBullet"/>
       </w:pPr>
       <w:r>
-        <w:t>5.11 Restorasi Ekosistem</w:t>
+        <w:t>5.11 Siklus Air (Hidrologi) Lengkap</w:t>
+      </w:r>
+    </w:p>
+    <w:p>
+      <w:pPr>
+        <w:pStyle w:val="ListBullet"/>
+      </w:pPr>
+      <w:r>
+        <w:t>5.12 Pola Cuaca (Sistem Tekanan)</w:t>
       </w:r>
     </w:p>
     <w:p>
@@ -1087,7 +1231,7 @@
         <w:spacing w:line="360" w:lineRule="auto"/>
       </w:pPr>
       <w:r>
-        <w:t>Prompt bumi dan antariksa paling kuat ketika menampilkan skala besar (planet, benua) dengan animasi tempo lambat untuk memungkinkan pemahaman.</w:t>
+        <w:t>Prompt bumi dan antariksa paling kuat ketika menampilkan skala besar (planet, benua) dengan animasi tempo lambat untuk memungkinkan pemahaman. Gabungkan data nyata (statistik, grafik) dengan visualisasi untuk dampak edukatif maksimal.</w:t>
       </w:r>
     </w:p>
     <w:p>
@@ -1135,7 +1279,7 @@
         <w:pStyle w:val="ListBullet"/>
       </w:pPr>
       <w:r>
-        <w:t>6.2 Magnetisme</w:t>
+        <w:t>6.2 DNA Replication (Fisika-Molekuler)</w:t>
       </w:r>
     </w:p>
     <w:p>
@@ -1143,7 +1287,7 @@
         <w:pStyle w:val="ListBullet"/>
       </w:pPr>
       <w:r>
-        <w:t>6.3 Listrik Statis</w:t>
+        <w:t>6.3 Elektrolisis Air (Kimia)</w:t>
       </w:r>
     </w:p>
     <w:p>
@@ -1151,7 +1295,7 @@
         <w:pStyle w:val="ListBullet"/>
       </w:pPr>
       <w:r>
-        <w:t>6.4 Arus Listrik Searah</w:t>
+        <w:t>6.4 Fotosintesis (Biologi)</w:t>
       </w:r>
     </w:p>
     <w:p>
@@ -1159,7 +1303,7 @@
         <w:pStyle w:val="ListBullet"/>
       </w:pPr>
       <w:r>
-        <w:t>6.5 Transpor Membran</w:t>
+        <w:t>6.5 Sistem Tata Surya (Astronomi)</w:t>
       </w:r>
     </w:p>
     <w:p>
@@ -1167,7 +1311,7 @@
         <w:pStyle w:val="ListBullet"/>
       </w:pPr>
       <w:r>
-        <w:t>6.6 Gaya Realistis</w:t>
+        <w:t>6.6 Style Cinematic Science</w:t>
       </w:r>
     </w:p>
     <w:p>
@@ -1175,7 +1319,7 @@
         <w:pStyle w:val="ListBullet"/>
       </w:pPr>
       <w:r>
-        <w:t>6.7 Gaya Ilustrasi 2D</w:t>
+        <w:t>6.7 Style Technical Diagram</w:t>
       </w:r>
     </w:p>
     <w:p>
@@ -1183,7 +1327,39 @@
         <w:pStyle w:val="ListBullet"/>
       </w:pPr>
       <w:r>
-        <w:t>6.8 Gaya 3D Render</w:t>
+        <w:t>6.8 Style Short-Form Content</w:t>
+      </w:r>
+    </w:p>
+    <w:p>
+      <w:pPr>
+        <w:pStyle w:val="ListBullet"/>
+      </w:pPr>
+      <w:r>
+        <w:t>6.9 Prompt Dasar vs Detail</w:t>
+      </w:r>
+    </w:p>
+    <w:p>
+      <w:pPr>
+        <w:pStyle w:val="ListBullet"/>
+      </w:pPr>
+      <w:r>
+        <w:t>6.10 Sudut Eye-Level</w:t>
+      </w:r>
+    </w:p>
+    <w:p>
+      <w:pPr>
+        <w:pStyle w:val="ListBullet"/>
+      </w:pPr>
+      <w:r>
+        <w:t>6.11 Sudut Bird's Eye</w:t>
+      </w:r>
+    </w:p>
+    <w:p>
+      <w:pPr>
+        <w:pStyle w:val="ListBullet"/>
+      </w:pPr>
+      <w:r>
+        <w:t>6.12 Sudut Macro/Close-up</w:t>
       </w:r>
     </w:p>
     <w:p>
@@ -1199,6 +1375,14 @@
         <w:spacing w:line="360" w:lineRule="auto"/>
       </w:pPr>
       <w:r>
+        <w:t>Gunakan formula ini sebagai fondasi:</w:t>
+      </w:r>
+    </w:p>
+    <w:p>
+      <w:pPr>
+        <w:spacing w:line="360" w:lineRule="auto"/>
+      </w:pPr>
+      <w:r>
         <w:t>Penjelasan komponen:</w:t>
       </w:r>
     </w:p>
@@ -1207,7 +1391,7 @@
         <w:pStyle w:val="Heading1"/>
       </w:pPr>
       <w:r>
-        <w:t>6.2 Prompt Tambahan Berdasarkan Subjek</w:t>
+        <w:t>6.2 Contoh Prompt Lengkap dengan Semua Elemen</w:t>
       </w:r>
     </w:p>
     <w:p>
@@ -1215,7 +1399,183 @@
         <w:pStyle w:val="Heading1"/>
       </w:pPr>
       <w:r>
-        <w:t>6.3 Variasi Gaya Visual</w:t>
+        <w:t>6.3 Variasi Prompt untuk Platform Berbeda</w:t>
+      </w:r>
+    </w:p>
+    <w:p>
+      <w:pPr>
+        <w:pStyle w:val="Heading2"/>
+      </w:pPr>
+      <w:r>
+        <w:t>6.3.1 Runway Gen-2 / Pika Labs</w:t>
+      </w:r>
+    </w:p>
+    <w:p>
+      <w:pPr>
+        <w:pStyle w:val="Heading2"/>
+      </w:pPr>
+      <w:r>
+        <w:t>6.3.2 Stable Video Diffusion</w:t>
+      </w:r>
+    </w:p>
+    <w:p>
+      <w:pPr>
+        <w:pStyle w:val="Heading2"/>
+      </w:pPr>
+      <w:r>
+        <w:t>6.3.3 TikTok / Instagram Reels</w:t>
+      </w:r>
+    </w:p>
+    <w:p>
+      <w:pPr>
+        <w:pStyle w:val="Heading1"/>
+      </w:pPr>
+      <w:r>
+        <w:t>6.4 Teknik Modifikasi Prompt</w:t>
+      </w:r>
+    </w:p>
+    <w:p>
+      <w:pPr>
+        <w:pStyle w:val="Heading2"/>
+      </w:pPr>
+      <w:r>
+        <w:t>6.4.1 Menambah Detail Spesifik</w:t>
+      </w:r>
+    </w:p>
+    <w:p>
+      <w:pPr>
+        <w:pStyle w:val="Heading2"/>
+      </w:pPr>
+      <w:r>
+        <w:t>6.4.2 Mengubah Sudut Pandang</w:t>
+      </w:r>
+    </w:p>
+    <w:p>
+      <w:pPr>
+        <w:pStyle w:val="Heading1"/>
+      </w:pPr>
+      <w:r>
+        <w:t>6.5 Prompt untuk Topik Spesifik</w:t>
+      </w:r>
+    </w:p>
+    <w:p>
+      <w:pPr>
+        <w:pStyle w:val="Heading2"/>
+      </w:pPr>
+      <w:r>
+        <w:t>6.5.1 Fisika: Gaya dan Gerakan</w:t>
+      </w:r>
+    </w:p>
+    <w:p>
+      <w:pPr>
+        <w:pStyle w:val="Heading2"/>
+      </w:pPr>
+      <w:r>
+        <w:t>6.5.2 Kimia: Reaksi dan Struktur</w:t>
+      </w:r>
+    </w:p>
+    <w:p>
+      <w:pPr>
+        <w:pStyle w:val="Heading2"/>
+      </w:pPr>
+      <w:r>
+        <w:t>6.5.3 Biologi: Proses dan Struktur</w:t>
+      </w:r>
+    </w:p>
+    <w:p>
+      <w:pPr>
+        <w:pStyle w:val="Heading2"/>
+      </w:pPr>
+      <w:r>
+        <w:t>6.5.4 Bumi &amp; Antariksa: Skala Besar</w:t>
+      </w:r>
+    </w:p>
+    <w:p>
+      <w:pPr>
+        <w:pStyle w:val="Heading1"/>
+      </w:pPr>
+      <w:r>
+        <w:t>6.6 Tips Adaptasi untuk Platform Berbeda</w:t>
+      </w:r>
+    </w:p>
+    <w:p>
+      <w:pPr>
+        <w:pStyle w:val="Heading1"/>
+      </w:pPr>
+      <w:r>
+        <w:t>6.7 Checklist Prompt Sebelum Generate</w:t>
+      </w:r>
+    </w:p>
+    <w:p>
+      <w:pPr>
+        <w:pStyle w:val="ListBullet"/>
+      </w:pPr>
+      <w:r>
+        <w:t>[ ] Subjek jelas dan spesifik</w:t>
+      </w:r>
+    </w:p>
+    <w:p>
+      <w:pPr>
+        <w:pStyle w:val="ListBullet"/>
+      </w:pPr>
+      <w:r>
+        <w:t>[ ] Aksi/proses deskriptif</w:t>
+      </w:r>
+    </w:p>
+    <w:p>
+      <w:pPr>
+        <w:pStyle w:val="ListBullet"/>
+      </w:pPr>
+      <w:r>
+        <w:t>[ ] Detail visual disebutkan (warna, tekstur, cahaya)</w:t>
+      </w:r>
+    </w:p>
+    <w:p>
+      <w:pPr>
+        <w:pStyle w:val="ListBullet"/>
+      </w:pPr>
+      <w:r>
+        <w:t>[ ] Konteks/latar ditentukan</w:t>
+      </w:r>
+    </w:p>
+    <w:p>
+      <w:pPr>
+        <w:pStyle w:val="ListBullet"/>
+      </w:pPr>
+      <w:r>
+        <w:t>[ ] Gaya visual cocok untuk audiens</w:t>
+      </w:r>
+    </w:p>
+    <w:p>
+      <w:pPr>
+        <w:pStyle w:val="ListBullet"/>
+      </w:pPr>
+      <w:r>
+        <w:t>[ ] Parameter teknis lengkap (rasio, durasi, kualitas)</w:t>
+      </w:r>
+    </w:p>
+    <w:p>
+      <w:pPr>
+        <w:pStyle w:val="ListBullet"/>
+      </w:pPr>
+      <w:r>
+        <w:t>[ ] Tidak melebihi 50 kata</w:t>
+      </w:r>
+    </w:p>
+    <w:p>
+      <w:pPr>
+        <w:pStyle w:val="ListBullet"/>
+      </w:pPr>
+      <w:r>
+        <w:t>[ ] Menggunakan kata kerja aktif</w:t>
+      </w:r>
+    </w:p>
+    <w:p>
+      <w:pPr>
+        <w:pStyle w:val="ListBullet"/>
+      </w:pPr>
+      <w:r>
+        <w:t>[ ] Sudut kamera disebutkan</w:t>
       </w:r>
     </w:p>
     <w:p>
@@ -1223,7 +1583,23 @@
         <w:spacing w:line="360" w:lineRule="auto"/>
       </w:pPr>
       <w:r>
-        <w:t>Pilih gaya yang sesuai dengan target audiens:</w:t>
+        <w:t>Prompt terbaik adalah yang spesifik, visual, dan sesuai dengan kemampuan platform target. Uji beberapa variasi dan pilih yang paling jelas. Gunakan formula sebagai template, tambahkan detail sesuai kebutuhan.</w:t>
+      </w:r>
+    </w:p>
+    <w:p>
+      <w:pPr>
+        <w:pStyle w:val="Title"/>
+      </w:pPr>
+      <w:r>
+        <w:t>Referensi Cepat Prompt</w:t>
+      </w:r>
+    </w:p>
+    <w:p>
+      <w:pPr>
+        <w:spacing w:line="360" w:lineRule="auto"/>
+      </w:pPr>
+      <w:r>
+        <w:t>Daftar prompt ringkas untuk pencarian cepat.</w:t>
       </w:r>
     </w:p>
     <w:p>
@@ -1231,31 +1607,127 @@
         <w:pStyle w:val="Heading1"/>
       </w:pPr>
       <w:r>
-        <w:t>6.4 Tips Adaptasi untuk Platform Berbeda</w:t>
-      </w:r>
-    </w:p>
-    <w:p>
-      <w:pPr>
-        <w:spacing w:line="360" w:lineRule="auto"/>
-      </w:pPr>
-      <w:r>
-        <w:t>Prompt terbaik adalah yang spesifik, visual, dan sesuai dengan kemampuan platform target. Uji beberapa variasi dan pilih yang paling jelas.</w:t>
-      </w:r>
-    </w:p>
-    <w:p>
-      <w:pPr>
-        <w:pStyle w:val="Title"/>
-      </w:pPr>
-      <w:r>
-        <w:t>Referensi Cepat Prompt</w:t>
-      </w:r>
-    </w:p>
-    <w:p>
-      <w:pPr>
-        <w:spacing w:line="360" w:lineRule="auto"/>
-      </w:pPr>
-      <w:r>
-        <w:t>Daftar prompt ringkas untuk pencarian cepat.</w:t>
+        <w:t>Fisika</w:t>
+      </w:r>
+    </w:p>
+    <w:p>
+      <w:pPr>
+        <w:pStyle w:val="ListNumber"/>
+      </w:pPr>
+      <w:r>
+        <w:t>Hukum Newton I: Bola diam di meja, ditabrak bola lain, bergerak lurus — visualisasi inersia, gaya realistis, 16:9</w:t>
+      </w:r>
+    </w:p>
+    <w:p>
+      <w:pPr>
+        <w:pStyle w:val="ListNumber"/>
+      </w:pPr>
+      <w:r>
+        <w:t>Hukum Newton II: Dua gerobak massa beda ditarik gaya sama — F=ma, grafik percepatan, 16:9</w:t>
+      </w:r>
+    </w:p>
+    <w:p>
+      <w:pPr>
+        <w:pStyle w:val="ListNumber"/>
+      </w:pPr>
+      <w:r>
+        <w:t>Gravitasi: Benda jatuh bebas, percepatan meningkat — jejak gerakan, gaya demonstrasi, 16:9</w:t>
+      </w:r>
+    </w:p>
+    <w:p>
+      <w:pPr>
+        <w:pStyle w:val="ListNumber"/>
+      </w:pPr>
+      <w:r>
+        <w:t>Proyektil: Peluru lintasan parabola dengan grid koordinat — sudut 45 derajat jarak terjauh, 16:9</w:t>
+      </w:r>
+    </w:p>
+    <w:p>
+      <w:pPr>
+        <w:pStyle w:val="ListNumber"/>
+      </w:pPr>
+      <w:r>
+        <w:t>Energi mekanik: Bandul ayunan, energi potensial-kinetik bolak-balik — diagram energi, 16:9</w:t>
+      </w:r>
+    </w:p>
+    <w:p>
+      <w:pPr>
+        <w:pStyle w:val="ListNumber"/>
+      </w:pPr>
+      <w:r>
+        <w:t>Kekekalan energi: Roller coaster turun-naik, total energi konstan — grafik energi, 16:9</w:t>
+      </w:r>
+    </w:p>
+    <w:p>
+      <w:pPr>
+        <w:pStyle w:val="ListNumber"/>
+      </w:pPr>
+      <w:r>
+        <w:t>Pemuaian: Batang logam dipanaskan memuai — skala pengukuran, termometer digital, 16:9</w:t>
+      </w:r>
+    </w:p>
+    <w:p>
+      <w:pPr>
+        <w:pStyle w:val="ListNumber"/>
+      </w:pPr>
+      <w:r>
+        <w:t>Gelombang bunyi: Partikel udara rapatan-regangan longitudinal — warna berbeda, 16:9</w:t>
+      </w:r>
+    </w:p>
+    <w:p>
+      <w:pPr>
+        <w:pStyle w:val="ListNumber"/>
+      </w:pPr>
+      <w:r>
+        <w:t>Gelombang transversal: Tali digetarkan puncak-lembah — frekuensi amplitudo, 16:9</w:t>
+      </w:r>
+    </w:p>
+    <w:p>
+      <w:pPr>
+        <w:pStyle w:val="ListNumber"/>
+      </w:pPr>
+      <w:r>
+        <w:t>Interferensi: Dua sumber gelombang pola interferensi — konstruktif-destruktif, 16:9</w:t>
+      </w:r>
+    </w:p>
+    <w:p>
+      <w:pPr>
+        <w:pStyle w:val="ListNumber"/>
+      </w:pPr>
+      <w:r>
+        <w:t>Pemantulan: Sinar cahaya cermin datar — sudut datang=pantul, garis normal, 16:9</w:t>
+      </w:r>
+    </w:p>
+    <w:p>
+      <w:pPr>
+        <w:pStyle w:val="ListNumber"/>
+      </w:pPr>
+      <w:r>
+        <w:t>Pembiasan: Cahaya udara ke air membelok — hukum Snellius, sudut ditandai, 16:9</w:t>
+      </w:r>
+    </w:p>
+    <w:p>
+      <w:pPr>
+        <w:pStyle w:val="ListNumber"/>
+      </w:pPr>
+      <w:r>
+        <w:t>Lensa cembung: Benda depan lensa bayangan riil — jarak benda-ay角, 16:9</w:t>
+      </w:r>
+    </w:p>
+    <w:p>
+      <w:pPr>
+        <w:pStyle w:val="ListNumber"/>
+      </w:pPr>
+      <w:r>
+        <w:t>Dispensi: Cahaya putih melalui prisma — spektrum warna, sudut deviasi, 16:9</w:t>
+      </w:r>
+    </w:p>
+    <w:p>
+      <w:pPr>
+        <w:pStyle w:val="ListNumber"/>
+      </w:pPr>
+      <w:r>
+        <w:t>Induksi elektromagnetik: Magnet masuk kumparan — arus induksi, hukum Lenz, 16:9</w:t>
       </w:r>
     </w:p>
     <w:p>
@@ -1263,7 +1735,7 @@
         <w:pStyle w:val="Heading1"/>
       </w:pPr>
       <w:r>
-        <w:t>Fisika</w:t>
+        <w:t>Kimia</w:t>
       </w:r>
     </w:p>
     <w:p>
@@ -1271,7 +1743,7 @@
         <w:pStyle w:val="ListNumber"/>
       </w:pPr>
       <w:r>
-        <w:t>Hukum Newton I: Bola diam di meja, ditabrak bola lain, bergerak lurus — visualisasi inersia, gaya realistis, 16:9</w:t>
+        <w:t>Pembakaran: Natrium + air reaktif — gelembung gas, nyala api, demo lab, 16:9</w:t>
       </w:r>
     </w:p>
     <w:p>
@@ -1279,7 +1751,7 @@
         <w:pStyle w:val="ListNumber"/>
       </w:pPr>
       <w:r>
-        <w:t>Hukum Newton II: Dua gerobak massa beda ditarik gaya sama — F=ma, grafik percepatan, 16:9</w:t>
+        <w:t>Asam-basa: Indikator酚olftalein perubahan warna — netralisasi, grafik pH, 16:9</w:t>
       </w:r>
     </w:p>
     <w:p>
@@ -1287,7 +1759,7 @@
         <w:pStyle w:val="ListNumber"/>
       </w:pPr>
       <w:r>
-        <w:t>Gravitasi: Benda jatuh bebas, percepatan meningkat — jejak gerakan, gaya demonstrasi, 16:9</w:t>
+        <w:t>Presipitasi: Dua larutan campuran endapan putih — partikel mengendap, 16:9</w:t>
       </w:r>
     </w:p>
     <w:p>
@@ -1295,7 +1767,7 @@
         <w:pStyle w:val="ListNumber"/>
       </w:pPr>
       <w:r>
-        <w:t>Proyektil: Peluru lintasan parabola dengan grid koordinat — sudut 45 derajat jarak terjauh, 16:9</w:t>
+        <w:t>Redoks: Zinc dalam CuSO4 — tembaga mengendap, larutan berubah warna, 16:9</w:t>
       </w:r>
     </w:p>
     <w:p>
@@ -1303,7 +1775,7 @@
         <w:pStyle w:val="ListNumber"/>
       </w:pPr>
       <w:r>
-        <w:t>Energi mekanik: Bandul ayunan, energi potensial-kinetik bolak-balik — diagram energi, 16:9</w:t>
+        <w:t>Atom Bohr: Elektron orbit tingkat energi — transisi memancarkan foton, 16:9</w:t>
       </w:r>
     </w:p>
     <w:p>
@@ -1311,7 +1783,7 @@
         <w:pStyle w:val="ListNumber"/>
       </w:pPr>
       <w:r>
-        <w:t>Kekekalan energi: Roller coaster turun-naik, total energi konstan — grafik energi, 16:9</w:t>
+        <w:t>Ikatan ion: Na + Cl → NaCl — kisi kristal terbentuk, 16:9</w:t>
       </w:r>
     </w:p>
     <w:p>
@@ -1319,7 +1791,7 @@
         <w:pStyle w:val="ListNumber"/>
       </w:pPr>
       <w:r>
-        <w:t>Pemuaian: Batang logam dipanaskan memuai — skala pengukuran, termometer digital, 16:9</w:t>
+        <w:t>Ikatan kovalen: H + H → H2 — orbital overlap, molekul stabil, 16:9</w:t>
       </w:r>
     </w:p>
     <w:p>
@@ -1327,7 +1799,7 @@
         <w:pStyle w:val="ListNumber"/>
       </w:pPr>
       <w:r>
-        <w:t>Gelombang bunyi: Partikel udara rapatan-regangan longitudinal — warna berbeda, 16:9</w:t>
+        <w:t>Pelarutan: Gula larut dalam air — molekul tersebar, tingkat molekuler, 16:9</w:t>
       </w:r>
     </w:p>
     <w:p>
@@ -1335,7 +1807,7 @@
         <w:pStyle w:val="ListNumber"/>
       </w:pPr>
       <w:r>
-        <w:t>Gelombang transversal: Tali digetarkan puncak-lembah — frekuensi amplitudo, 16:9</w:t>
+        <w:t>Elektrolit: Larutan NaCl hantar listrik — lampu menyala vs gula, 16:9</w:t>
       </w:r>
     </w:p>
     <w:p>
@@ -1343,7 +1815,7 @@
         <w:pStyle w:val="ListNumber"/>
       </w:pPr>
       <w:r>
-        <w:t>Interferensi: Dua sumber gelombang pola interferensi — konstruktif-destruktif, 16:9</w:t>
+        <w:t>Kelarutan: Garam air dingin vs panas — Kristal larut lebih cepat panas, 16:9</w:t>
       </w:r>
     </w:p>
     <w:p>
@@ -1351,7 +1823,7 @@
         <w:pStyle w:val="ListNumber"/>
       </w:pPr>
       <w:r>
-        <w:t>Pemantulan: Sinar cahaya cermin datar — sudut datang=pantул, garis normal, 16:9</w:t>
+        <w:t>Metana CH4: Geometri tetrahedral — rotasi molekul, 16:9</w:t>
       </w:r>
     </w:p>
     <w:p>
@@ -1359,7 +1831,7 @@
         <w:pStyle w:val="ListNumber"/>
       </w:pPr>
       <w:r>
-        <w:t>Pembiasan: Cahaya udara ke air membelok — hukum Snellius, sudut ditandai, 16:9</w:t>
+        <w:t>Isomeri: n-butana vs isobutana — struktur berbeda rumus sama, 16:9</w:t>
       </w:r>
     </w:p>
     <w:p>
@@ -1367,7 +1839,23 @@
         <w:pStyle w:val="ListNumber"/>
       </w:pPr>
       <w:r>
-        <w:t>Lensa cembung: Benda depan lensa bayangan riil — jarak benda-ay角, 16:9</w:t>
+        <w:t>Eksoterm vs endoterm: NaOH panas vs NH4NO3 dingin — diagram energi, 16:9</w:t>
+      </w:r>
+    </w:p>
+    <w:p>
+      <w:pPr>
+        <w:pStyle w:val="ListNumber"/>
+      </w:pPr>
+      <w:r>
+        <w:t>Kesetimbangan: Le Chatelier principle — shift konsentrasi/tekanan, 16:9</w:t>
+      </w:r>
+    </w:p>
+    <w:p>
+      <w:pPr>
+        <w:pStyle w:val="ListNumber"/>
+      </w:pPr>
+      <w:r>
+        <w:t>Laju reaksi: Faktor suhu/konsentrasi/katalis — grafik konsentrasi-waktu, 16:9</w:t>
       </w:r>
     </w:p>
     <w:p>
@@ -1375,7 +1863,7 @@
         <w:pStyle w:val="Heading1"/>
       </w:pPr>
       <w:r>
-        <w:t>Kimia</w:t>
+        <w:t>Biologi</w:t>
       </w:r>
     </w:p>
     <w:p>
@@ -1383,7 +1871,7 @@
         <w:pStyle w:val="ListNumber"/>
       </w:pPr>
       <w:r>
-        <w:t>Pembakaran: Natrium + air reaktif — gelembung gas, nyala api, demo lab, 16:9</w:t>
+        <w:t>Sel hewan: Organel terlihat — inti, mitokondria, ribosom, label muncul, 16:9</w:t>
       </w:r>
     </w:p>
     <w:p>
@@ -1391,7 +1879,7 @@
         <w:pStyle w:val="ListNumber"/>
       </w:pPr>
       <w:r>
-        <w:t>Asam-basa: Indikator酚olftalein perubahan warna — netralisasi, grafik pH, 16:9</w:t>
+        <w:t>Fotosintesis: Daun serap cahaya — CO2 masuk, O2 keluar, persamaan kimia, 16:9</w:t>
       </w:r>
     </w:p>
     <w:p>
@@ -1399,7 +1887,7 @@
         <w:pStyle w:val="ListNumber"/>
       </w:pPr>
       <w:r>
-        <w:t>Presipitasi: Dua larutan campuran endapan putih — partikel mengendap, 16:9</w:t>
+        <w:t>Respirasi sel: Glukosa pecah di mitokondria — ATP dihasilkan, rantai elektron, 16:9</w:t>
       </w:r>
     </w:p>
     <w:p>
@@ -1407,7 +1895,7 @@
         <w:pStyle w:val="ListNumber"/>
       </w:pPr>
       <w:r>
-        <w:t>Redoks: Zinc dalam CuSO4 — tembaga mengendap, larutan berubah warna, 16:9</w:t>
+        <w:t>Mitosis: Sel membelah dua — profase metafase anafase telofase, 16:9</w:t>
       </w:r>
     </w:p>
     <w:p>
@@ -1415,7 +1903,7 @@
         <w:pStyle w:val="ListNumber"/>
       </w:pPr>
       <w:r>
-        <w:t>Atom Bohr: Elektron orbit tingkat energi — transisi memancarkan foton, 16:9</w:t>
+        <w:t>Meiosis: Pembentukan gamet — crossing over, reduksi kromosom, 16:9</w:t>
       </w:r>
     </w:p>
     <w:p>
@@ -1423,7 +1911,7 @@
         <w:pStyle w:val="ListNumber"/>
       </w:pPr>
       <w:r>
-        <w:t>Ikatan ion: Na + Cl → NaCl — kisi kristal terbentuk, 16:9</w:t>
+        <w:t>Peredaran darah: Jantung pompa darah — sirkulasi paru-sistemik, warna merah-biru, 16:9</w:t>
       </w:r>
     </w:p>
     <w:p>
@@ -1431,7 +1919,7 @@
         <w:pStyle w:val="ListNumber"/>
       </w:pPr>
       <w:r>
-        <w:t>Ikatan kovalen: H + H → H2 — orbital overlap, molekul stabil, 16:9</w:t>
+        <w:t>Pencernaan: Makanan through saluran cerna — lambung usus penyerapan, 16:9</w:t>
       </w:r>
     </w:p>
     <w:p>
@@ -1439,7 +1927,7 @@
         <w:pStyle w:val="ListNumber"/>
       </w:pPr>
       <w:r>
-        <w:t>Pelarutan: Gula larut dalam air — molekul tersebar, tingkat molekuler, 16:9</w:t>
+        <w:t>Saraf: Impuls neuron ke neuron — sinapsis neurotransmitter, 16:9</w:t>
       </w:r>
     </w:p>
     <w:p>
@@ -1447,7 +1935,7 @@
         <w:pStyle w:val="ListNumber"/>
       </w:pPr>
       <w:r>
-        <w:t>Elektrolit: Larutan NaCl hantar listrik — lampu menyala vs gula, 16:9</w:t>
+        <w:t>Rantai makanan: Produsen-konsumen-dekomposer — panah aliran energi, 16:9</w:t>
       </w:r>
     </w:p>
     <w:p>
@@ -1455,7 +1943,7 @@
         <w:pStyle w:val="ListNumber"/>
       </w:pPr>
       <w:r>
-        <w:t>Kelarutan: Garam air dingin vs panas — Kristal larut lebih cepat panas, 16:9</w:t>
+        <w:t>Siklus karbon: CO2 atmosfer-tumbuhan-hewan-kembali, siklus tertutup, 16:9</w:t>
       </w:r>
     </w:p>
     <w:p>
@@ -1463,7 +1951,7 @@
         <w:pStyle w:val="ListNumber"/>
       </w:pPr>
       <w:r>
-        <w:t>Metana CH4: Geometri tetrahedral — rotasi molekul, 16:9</w:t>
+        <w:t>Siklus nitrogen: Fiksasi-nitrifikasi-asimilasi-denitrifikasi, 16:9</w:t>
       </w:r>
     </w:p>
     <w:p>
@@ -1471,7 +1959,47 @@
         <w:pStyle w:val="ListNumber"/>
       </w:pPr>
       <w:r>
-        <w:t>Isomeri: n-butana vs isobutana — struktur berbeda rumus sama, 16:9</w:t>
+        <w:t>Daur air: Evaporasi-kondensasi-presipitasi-infiltrasi, siklus tertutup, 16:9</w:t>
+      </w:r>
+    </w:p>
+    <w:p>
+      <w:pPr>
+        <w:pStyle w:val="ListNumber"/>
+      </w:pPr>
+      <w:r>
+        <w:t>Seleksi alam: Ngengat sebelum-sesudah industri — adaptasi warna, 16:9</w:t>
+      </w:r>
+    </w:p>
+    <w:p>
+      <w:pPr>
+        <w:pStyle w:val="ListNumber"/>
+      </w:pPr>
+      <w:r>
+        <w:t>Adaptasi: Paruh finch beda bentuk — adaptasi makanan, 16:9</w:t>
+      </w:r>
+    </w:p>
+    <w:p>
+      <w:pPr>
+        <w:pStyle w:val="ListNumber"/>
+      </w:pPr>
+      <w:r>
+        <w:t>Transkripsi-translasi: DNA→mRNA→protein, central dogma, 16:9</w:t>
+      </w:r>
+    </w:p>
+    <w:p>
+      <w:pPr>
+        <w:pStyle w:val="ListNumber"/>
+      </w:pPr>
+      <w:r>
+        <w:t>Homeostasis: Regulasi suhu/pH/glukosa, feedback loop, 16:9</w:t>
+      </w:r>
+    </w:p>
+    <w:p>
+      <w:pPr>
+        <w:pStyle w:val="ListNumber"/>
+      </w:pPr>
+      <w:r>
+        <w:t>Imunitas: Fagositosis-antibodi-memory cell, respons imun, 16:9</w:t>
       </w:r>
     </w:p>
     <w:p>
@@ -1479,7 +2007,7 @@
         <w:pStyle w:val="Heading1"/>
       </w:pPr>
       <w:r>
-        <w:t>Biologi</w:t>
+        <w:t>Bumi &amp; Antariksa</w:t>
       </w:r>
     </w:p>
     <w:p>
@@ -1487,7 +2015,7 @@
         <w:pStyle w:val="ListNumber"/>
       </w:pPr>
       <w:r>
-        <w:t>Sel hewan: Organel terlihat — inti, mitokondria, ribosom, label muncul, 16:9</w:t>
+        <w:t>Tata surya: 8 planet orbit matahari — ukuran relatif, sabuk asteroid, 16:9</w:t>
       </w:r>
     </w:p>
     <w:p>
@@ -1495,7 +2023,7 @@
         <w:pStyle w:val="ListNumber"/>
       </w:pPr>
       <w:r>
-        <w:t>Fotosintesis: Daun serap cahaya — CO2 masuk, O2 keluar, persamaan kimia, 16:9</w:t>
+        <w:t>Fase bulan: Revolusi bumi — new sampai full moon, pencahayaan konsisten, 16:9</w:t>
       </w:r>
     </w:p>
     <w:p>
@@ -1503,7 +2031,7 @@
         <w:pStyle w:val="ListNumber"/>
       </w:pPr>
       <w:r>
-        <w:t>Respirasi sel: Glukosa pecah di mitokondria — ATP dihasilkan, rantai elektron, 16:9</w:t>
+        <w:t>Gerhana bulan: Bumi antara matahari-bulan — umbra-penumbra, bulan kemerahan, 16:9</w:t>
       </w:r>
     </w:p>
     <w:p>
@@ -1511,7 +2039,7 @@
         <w:pStyle w:val="ListNumber"/>
       </w:pPr>
       <w:r>
-        <w:t>Mitosis: Sel membelah dua — profase metafase anafase telofase, 16:9</w:t>
+        <w:t>Gerhana matahari: Bulan antara matahari-bumi — total-annular-partial, 16:9</w:t>
       </w:r>
     </w:p>
     <w:p>
@@ -1519,7 +2047,7 @@
         <w:pStyle w:val="ListNumber"/>
       </w:pPr>
       <w:r>
-        <w:t>Peredaran darah: Jantung pompa darah — sirkulasi paru-sistemik, warna merah-biru, 16:9</w:t>
+        <w:t>Rotasi-revolusi bumi: Siang-malam, musim, kemiringan sumbu 23.5°, 16:9</w:t>
       </w:r>
     </w:p>
     <w:p>
@@ -1527,7 +2055,7 @@
         <w:pStyle w:val="ListNumber"/>
       </w:pPr>
       <w:r>
-        <w:t>Pencernaan: MakananThrough saluran cerna — lambung usus penyerapan, 16:9</w:t>
+        <w:t>Lempeng tektonik: Pergerakan lempeng — divergen-konvergen-transform, 16:9</w:t>
       </w:r>
     </w:p>
     <w:p>
@@ -1535,7 +2063,7 @@
         <w:pStyle w:val="ListNumber"/>
       </w:pPr>
       <w:r>
-        <w:t>Saraf: Impuls neuron ke neuron — sinapsis neurotransmitter, 16:9</w:t>
+        <w:t>Siklus batuan: Igneous-sedimentary-metamorf-magma — siklus tak berujung, 16:9</w:t>
       </w:r>
     </w:p>
     <w:p>
@@ -1543,7 +2071,7 @@
         <w:pStyle w:val="ListNumber"/>
       </w:pPr>
       <w:r>
-        <w:t>Rantai makanan: Produsen-konsumen-dekomposer — panah aliran energi, 16:9</w:t>
+        <w:t>Interior bumi: Kerak-mantel-inti luar-inti dalam — suhu tekanan meningkat, 16:9</w:t>
       </w:r>
     </w:p>
     <w:p>
@@ -1551,7 +2079,7 @@
         <w:pStyle w:val="ListNumber"/>
       </w:pPr>
       <w:r>
-        <w:t>Siklus karbon: CO2 atmosfer-tumbuhan-hewan-kembali, siklus tertutup, 16:9</w:t>
+        <w:t>Gunung berapi: Tipe erupsi effusive-explosive-plinian, 16:9</w:t>
       </w:r>
     </w:p>
     <w:p>
@@ -1559,7 +2087,7 @@
         <w:pStyle w:val="ListNumber"/>
       </w:pPr>
       <w:r>
-        <w:t>Daur air: Evaporasi-kondensasi-presipitasi-infiltrasi, siklus tertutup, 16:9</w:t>
+        <w:t>Gempa bumi: Gelombang P-S merambat, episentrum-fokus, 16:9</w:t>
       </w:r>
     </w:p>
     <w:p>
@@ -1567,7 +2095,7 @@
         <w:pStyle w:val="ListNumber"/>
       </w:pPr>
       <w:r>
-        <w:t>Seleksi alam: Ngengat sebelum-sesudah industri — adaptasi warna, 16:9</w:t>
+        <w:t>Siklus air: Evaporasi-kondensasi-presipitasi-runoff, siklus tertutup, 16:9</w:t>
       </w:r>
     </w:p>
     <w:p>
@@ -1575,7 +2103,63 @@
         <w:pStyle w:val="ListNumber"/>
       </w:pPr>
       <w:r>
-        <w:t>Adaptasi: Paruh finch beda bentuk — adaptasi makanan, 16:9</w:t>
+        <w:t>Pola cuaca: Tekanan tinggi-rendah bergerak — angin berputar, fronts, 16:9</w:t>
+      </w:r>
+    </w:p>
+    <w:p>
+      <w:pPr>
+        <w:pStyle w:val="ListNumber"/>
+      </w:pPr>
+      <w:r>
+        <w:t>El Nino-La Nina: Anomali suhu Pasifik, dampak cuaca global, 16:9</w:t>
+      </w:r>
+    </w:p>
+    <w:p>
+      <w:pPr>
+        <w:pStyle w:val="ListNumber"/>
+      </w:pPr>
+      <w:r>
+        <w:t>Efek rumah kaca: Radiasi terperangkap gas — temperatur meningkat, 16:9</w:t>
+      </w:r>
+    </w:p>
+    <w:p>
+      <w:pPr>
+        <w:pStyle w:val="ListNumber"/>
+      </w:pPr>
+      <w:r>
+        <w:t>Lapisan atmosfer: Troposfer-stratosfer-mesosfer-termosfer-eksosfer, 16:9</w:t>
+      </w:r>
+    </w:p>
+    <w:p>
+      <w:pPr>
+        <w:pStyle w:val="ListNumber"/>
+      </w:pPr>
+      <w:r>
+        <w:t>Deforestasi: Hutan gundul bertahap — erosi banjir meningkat, 16:9</w:t>
+      </w:r>
+    </w:p>
+    <w:p>
+      <w:pPr>
+        <w:pStyle w:val="ListNumber"/>
+      </w:pPr>
+      <w:r>
+        <w:t>Restorasi: Lahan kritis ditanami — vegetasi pulih, fauna kembali, 16:9</w:t>
+      </w:r>
+    </w:p>
+    <w:p>
+      <w:pPr>
+        <w:pStyle w:val="ListNumber"/>
+      </w:pPr>
+      <w:r>
+        <w:t>Polusi plastik: Mikroplastik rantai makanan, dampak ocean, 16:9</w:t>
+      </w:r>
+    </w:p>
+    <w:p>
+      <w:pPr>
+        <w:pStyle w:val="ListNumber"/>
+      </w:pPr>
+      <w:r>
+        <w:t>Energi terbarukan: Solar vs wind, efisiensi dan dampak, 16:9</w:t>
       </w:r>
     </w:p>
     <w:p>
@@ -1583,7 +2167,7 @@
         <w:pStyle w:val="Heading1"/>
       </w:pPr>
       <w:r>
-        <w:t>Bumi &amp; Antariksa</w:t>
+        <w:t>Tambahan</w:t>
       </w:r>
     </w:p>
     <w:p>
@@ -1591,7 +2175,7 @@
         <w:pStyle w:val="ListNumber"/>
       </w:pPr>
       <w:r>
-        <w:t>Tata surya: 8 planet orbit matahari — ukuran relatif, sabuk asteroid, 16:9</w:t>
+        <w:t>Magnetisme: Garis medan magnet utara-selatan — serbuk besi menata diri, 16:9</w:t>
       </w:r>
     </w:p>
     <w:p>
@@ -1599,7 +2183,7 @@
         <w:pStyle w:val="ListNumber"/>
       </w:pPr>
       <w:r>
-        <w:t>Fase bulan: Revolusi bumi — new sampai full moon, pencahayaan konsisten, 16:9</w:t>
+        <w:t>Listrik statis: Balon gosok rambut — elektron berpindah, rambut berdiri, 16:9</w:t>
       </w:r>
     </w:p>
     <w:p>
@@ -1607,7 +2191,7 @@
         <w:pStyle w:val="ListNumber"/>
       </w:pPr>
       <w:r>
-        <w:t>Gerhana bulan: Bumi antara matahari-bulan — umbra-penumbra, bulan kemerahan, 16:9</w:t>
+        <w:t>Arus listrik: Sirkuit sederhana baterai-lampu — arus mengalir, lampu nyala, 16:9</w:t>
       </w:r>
     </w:p>
     <w:p>
@@ -1615,7 +2199,7 @@
         <w:pStyle w:val="ListNumber"/>
       </w:pPr>
       <w:r>
-        <w:t>Lempeng tektonik: Pergerakan lempeng — divergen-konvergen-transform, 16:9</w:t>
+        <w:t>Transpor membran: Difusi molekul melintasi membran — gradien konsentrasi, 16:9</w:t>
       </w:r>
     </w:p>
     <w:p>
@@ -1623,7 +2207,7 @@
         <w:pStyle w:val="ListNumber"/>
       </w:pPr>
       <w:r>
-        <w:t>Siklus batuan: Igneous-sedimentary-metamorf-magma — siklus tak berujung, 16:9</w:t>
+        <w:t>DNA replication: Helicase-polymerase, untai terpisah, basa komplementer, 16:9</w:t>
       </w:r>
     </w:p>
     <w:p>
@@ -1631,87 +2215,7 @@
         <w:pStyle w:val="ListNumber"/>
       </w:pPr>
       <w:r>
-        <w:t>Interior bumi: Kerak-mantel-inti luar-inti dalam — suhu tekanan meningkat, 16:9</w:t>
-      </w:r>
-    </w:p>
-    <w:p>
-      <w:pPr>
-        <w:pStyle w:val="ListNumber"/>
-      </w:pPr>
-      <w:r>
-        <w:t>Siklus air: Evaporasi-kondensasi-presipitasi-runoff, siklus tertutup, 16:9</w:t>
-      </w:r>
-    </w:p>
-    <w:p>
-      <w:pPr>
-        <w:pStyle w:val="ListNumber"/>
-      </w:pPr>
-      <w:r>
-        <w:t>Pola cuaca: Tekanan tinggi-rendah bergerak — angin berputar, fronts, 16:9</w:t>
-      </w:r>
-    </w:p>
-    <w:p>
-      <w:pPr>
-        <w:pStyle w:val="ListNumber"/>
-      </w:pPr>
-      <w:r>
-        <w:t>Efek rumah kaca: Radiasi matahari terperangkap gas — temperatur meningkat, 16:9</w:t>
-      </w:r>
-    </w:p>
-    <w:p>
-      <w:pPr>
-        <w:pStyle w:val="ListNumber"/>
-      </w:pPr>
-      <w:r>
-        <w:t>Deforestasi: Hutan gundul bertahap — erosi banjir meningkat, 16:9</w:t>
-      </w:r>
-    </w:p>
-    <w:p>
-      <w:pPr>
-        <w:pStyle w:val="ListNumber"/>
-      </w:pPr>
-      <w:r>
-        <w:t>Restorasi: Lahan kritis ditanami — vegetasi pulih, fauna kembali, 16:9</w:t>
-      </w:r>
-    </w:p>
-    <w:p>
-      <w:pPr>
-        <w:pStyle w:val="Heading1"/>
-      </w:pPr>
-      <w:r>
-        <w:t>Tambahan</w:t>
-      </w:r>
-    </w:p>
-    <w:p>
-      <w:pPr>
-        <w:pStyle w:val="ListNumber"/>
-      </w:pPr>
-      <w:r>
-        <w:t>Magnetisme: Garis medan magnet utara-selatan — serbuk besi menata diri, 16:9</w:t>
-      </w:r>
-    </w:p>
-    <w:p>
-      <w:pPr>
-        <w:pStyle w:val="ListNumber"/>
-      </w:pPr>
-      <w:r>
-        <w:t>Listrik statis: Balon gosok rambut — elektron berpindah, rambut berdiri, 16:9</w:t>
-      </w:r>
-    </w:p>
-    <w:p>
-      <w:pPr>
-        <w:pStyle w:val="ListNumber"/>
-      </w:pPr>
-      <w:r>
-        <w:t>Arus listrik: Sirkuit sederhana baterai-lampu — arus mengalir, lampu nyala, 16:9</w:t>
-      </w:r>
-    </w:p>
-    <w:p>
-      <w:pPr>
-        <w:pStyle w:val="ListNumber"/>
-      </w:pPr>
-      <w:r>
-        <w:t>Transpor membran: Difusi molekulmelintasi membran — gradien konsentrasi, 16:9</w:t>
+        <w:t>Induksi elektromagnetik: Magnet-kumparan, arus induksi, hukum Lenz, 16:9</w:t>
       </w:r>
     </w:p>
     <w:p>

</xml_diff>